<commit_message>
add teacher and change crud class
</commit_message>
<xml_diff>
--- a/docs/Training_Management_System_Database_Design.docx
+++ b/docs/Training_Management_System_Database_Design.docx
@@ -1,6 +1,6 @@
 
 <file path=word/document.xml><?xml version="1.0" encoding="utf-8"?>
-<w:document xmlns:wpc="http://schemas.microsoft.com/office/word/2010/wordprocessingCanvas" xmlns:cx="http://schemas.microsoft.com/office/drawing/2014/chartex" xmlns:cx1="http://schemas.microsoft.com/office/drawing/2015/9/8/chartex" xmlns:cx2="http://schemas.microsoft.com/office/drawing/2015/10/21/chartex" xmlns:cx3="http://schemas.microsoft.com/office/drawing/2016/5/9/chartex" xmlns:cx4="http://schemas.microsoft.com/office/drawing/2016/5/10/chartex" xmlns:cx5="http://schemas.microsoft.com/office/drawing/2016/5/11/chartex" xmlns:cx6="http://schemas.microsoft.com/office/drawing/2016/5/12/chartex" xmlns:cx7="http://schemas.microsoft.com/office/drawing/2016/5/13/chartex" xmlns:cx8="http://schemas.microsoft.com/office/drawing/2016/5/14/chartex" xmlns:mc="http://schemas.openxmlformats.org/markup-compatibility/2006" xmlns:aink="http://schemas.microsoft.com/office/drawing/2016/ink" xmlns:am3d="http://schemas.microsoft.com/office/drawing/2017/model3d" xmlns:o="urn:schemas-microsoft-com:office:office" xmlns:oel="http://schemas.microsoft.com/office/2019/extlst" xmlns:r="http://schemas.openxmlformats.org/officeDocument/2006/relationships" xmlns:m="http://schemas.openxmlformats.org/officeDocument/2006/math" xmlns:v="urn:schemas-microsoft-com:vml" xmlns:wp14="http://schemas.microsoft.com/office/word/2010/wordprocessingDrawing" xmlns:wp="http://schemas.openxmlformats.org/drawingml/2006/wordprocessingDrawing" xmlns:w10="urn:schemas-microsoft-com:office:word" xmlns:w="http://schemas.openxmlformats.org/wordprocessingml/2006/main" xmlns:w14="http://schemas.microsoft.com/office/word/2010/wordml" xmlns:w15="http://schemas.microsoft.com/office/word/2012/wordml" xmlns:w16cex="http://schemas.microsoft.com/office/word/2018/wordml/cex" xmlns:w16cid="http://schemas.microsoft.com/office/word/2016/wordml/cid" xmlns:w16="http://schemas.microsoft.com/office/word/2018/wordml" xmlns:w16du="http://schemas.microsoft.com/office/word/2023/wordml/word16du" xmlns:w16sdtdh="http://schemas.microsoft.com/office/word/2020/wordml/sdtdatahash" xmlns:w16sdtfl="http://schemas.microsoft.com/office/word/2024/wordml/sdtformatlock" xmlns:w16se="http://schemas.microsoft.com/office/word/2015/wordml/symex" xmlns:wpg="http://schemas.microsoft.com/office/word/2010/wordprocessingGroup" xmlns:wpi="http://schemas.microsoft.com/office/word/2010/wordprocessingInk" xmlns:wne="http://schemas.microsoft.com/office/word/2006/wordml" xmlns:wps="http://schemas.microsoft.com/office/word/2010/wordprocessingShape" mc:Ignorable="w14 w15 w16se w16cid w16 w16cex w16sdtdh w16sdtfl w16du wp14">
+<w:document xmlns:wpc="http://schemas.microsoft.com/office/word/2010/wordprocessingCanvas" xmlns:cx="http://schemas.microsoft.com/office/drawing/2014/chartex" xmlns:cx1="http://schemas.microsoft.com/office/drawing/2015/9/8/chartex" xmlns:cx2="http://schemas.microsoft.com/office/drawing/2015/10/21/chartex" xmlns:cx3="http://schemas.microsoft.com/office/drawing/2016/5/9/chartex" xmlns:cx4="http://schemas.microsoft.com/office/drawing/2016/5/10/chartex" xmlns:cx5="http://schemas.microsoft.com/office/drawing/2016/5/11/chartex" xmlns:cx6="http://schemas.microsoft.com/office/drawing/2016/5/12/chartex" xmlns:cx7="http://schemas.microsoft.com/office/drawing/2016/5/13/chartex" xmlns:cx8="http://schemas.microsoft.com/office/drawing/2016/5/14/chartex" xmlns:mc="http://schemas.openxmlformats.org/markup-compatibility/2006" xmlns:aink="http://schemas.microsoft.com/office/drawing/2016/ink" xmlns:am3d="http://schemas.microsoft.com/office/drawing/2017/model3d" xmlns:o="urn:schemas-microsoft-com:office:office" xmlns:oel="http://schemas.microsoft.com/office/2019/extlst" xmlns:r="http://schemas.openxmlformats.org/officeDocument/2006/relationships" xmlns:m="http://schemas.openxmlformats.org/officeDocument/2006/math" xmlns:v="urn:schemas-microsoft-com:vml" xmlns:wp14="http://schemas.microsoft.com/office/word/2010/wordprocessingDrawing" xmlns:wp="http://schemas.openxmlformats.org/drawingml/2006/wordprocessingDrawing" xmlns:w10="urn:schemas-microsoft-com:office:word" xmlns:w="http://schemas.openxmlformats.org/wordprocessingml/2006/main" xmlns:w14="http://schemas.microsoft.com/office/word/2010/wordml" xmlns:w15="http://schemas.microsoft.com/office/word/2012/wordml" xmlns:w16cei="http://schemas.microsoft.com/office/word/2026/wordml/cei" xmlns:w16cex="http://schemas.microsoft.com/office/word/2018/wordml/cex" xmlns:w16cid="http://schemas.microsoft.com/office/word/2016/wordml/cid" xmlns:w16="http://schemas.microsoft.com/office/word/2018/wordml" xmlns:w16du="http://schemas.microsoft.com/office/word/2023/wordml/word16du" xmlns:w16sdtdh="http://schemas.microsoft.com/office/word/2020/wordml/sdtdatahash" xmlns:w16sdtfl="http://schemas.microsoft.com/office/word/2024/wordml/sdtformatlock" xmlns:w16se="http://schemas.microsoft.com/office/word/2015/wordml/symex" xmlns:wpg="http://schemas.microsoft.com/office/word/2010/wordprocessingGroup" xmlns:wpi="http://schemas.microsoft.com/office/word/2010/wordprocessingInk" xmlns:wne="http://schemas.microsoft.com/office/word/2006/wordml" xmlns:wps="http://schemas.microsoft.com/office/word/2010/wordprocessingShape" mc:Ignorable="w14 w15 w16se w16cid w16 w16cex w16sdtdh w16sdtfl w16du wp14">
   <w:body>
     <w:p>
       <w:pPr>
@@ -1812,11 +1812,9 @@
       <w:pPr>
         <w:pStyle w:val="Heading2"/>
       </w:pPr>
-      <w:proofErr w:type="spellStart"/>
       <w:r>
-        <w:t>Training_sessions</w:t>
+        <w:t>Batch</w:t>
       </w:r>
-      <w:proofErr w:type="spellEnd"/>
     </w:p>
     <w:tbl>
       <w:tblPr>
@@ -1879,11 +1877,9 @@
             <w:pPr>
               <w:spacing w:after="0" w:line="240" w:lineRule="auto"/>
             </w:pPr>
-            <w:proofErr w:type="spellStart"/>
-            <w:r>
-              <w:t>session_id</w:t>
-            </w:r>
-            <w:proofErr w:type="spellEnd"/>
+            <w:r>
+              <w:t>id</w:t>
+            </w:r>
           </w:p>
         </w:tc>
         <w:tc>
@@ -2010,7 +2006,7 @@
             </w:pPr>
             <w:proofErr w:type="spellStart"/>
             <w:r>
-              <w:t>session_date</w:t>
+              <w:t>Start_date</w:t>
             </w:r>
             <w:proofErr w:type="spellEnd"/>
           </w:p>
@@ -2036,6 +2032,163 @@
             <w:pPr>
               <w:spacing w:after="0" w:line="240" w:lineRule="auto"/>
             </w:pPr>
+          </w:p>
+        </w:tc>
+      </w:tr>
+      <w:tr>
+        <w:tc>
+          <w:tcPr>
+            <w:tcW w:w="2880" w:type="dxa"/>
+          </w:tcPr>
+          <w:p>
+            <w:pPr>
+              <w:spacing w:after="0" w:line="240" w:lineRule="auto"/>
+            </w:pPr>
+            <w:proofErr w:type="spellStart"/>
+            <w:r>
+              <w:t>End_date</w:t>
+            </w:r>
+            <w:proofErr w:type="spellEnd"/>
+          </w:p>
+        </w:tc>
+        <w:tc>
+          <w:tcPr>
+            <w:tcW w:w="2880" w:type="dxa"/>
+          </w:tcPr>
+          <w:p>
+            <w:pPr>
+              <w:spacing w:after="0" w:line="240" w:lineRule="auto"/>
+            </w:pPr>
+            <w:r>
+              <w:t>DATE</w:t>
+            </w:r>
+          </w:p>
+        </w:tc>
+        <w:tc>
+          <w:tcPr>
+            <w:tcW w:w="2880" w:type="dxa"/>
+          </w:tcPr>
+          <w:p>
+            <w:pPr>
+              <w:spacing w:after="0" w:line="240" w:lineRule="auto"/>
+            </w:pPr>
+          </w:p>
+        </w:tc>
+      </w:tr>
+      <w:tr>
+        <w:tc>
+          <w:tcPr>
+            <w:tcW w:w="2880" w:type="dxa"/>
+          </w:tcPr>
+          <w:p>
+            <w:pPr>
+              <w:spacing w:after="0" w:line="240" w:lineRule="auto"/>
+            </w:pPr>
+            <w:r>
+              <w:t>Price</w:t>
+            </w:r>
+          </w:p>
+        </w:tc>
+        <w:tc>
+          <w:tcPr>
+            <w:tcW w:w="2880" w:type="dxa"/>
+          </w:tcPr>
+          <w:p>
+            <w:pPr>
+              <w:spacing w:after="0" w:line="240" w:lineRule="auto"/>
+            </w:pPr>
+            <w:r>
+              <w:t>double</w:t>
+            </w:r>
+          </w:p>
+        </w:tc>
+        <w:tc>
+          <w:tcPr>
+            <w:tcW w:w="2880" w:type="dxa"/>
+          </w:tcPr>
+          <w:p>
+            <w:pPr>
+              <w:spacing w:after="0" w:line="240" w:lineRule="auto"/>
+            </w:pPr>
+          </w:p>
+        </w:tc>
+      </w:tr>
+      <w:tr>
+        <w:tc>
+          <w:tcPr>
+            <w:tcW w:w="2880" w:type="dxa"/>
+          </w:tcPr>
+          <w:p>
+            <w:pPr>
+              <w:spacing w:after="0" w:line="240" w:lineRule="auto"/>
+            </w:pPr>
+            <w:r>
+              <w:t>Discount</w:t>
+            </w:r>
+          </w:p>
+        </w:tc>
+        <w:tc>
+          <w:tcPr>
+            <w:tcW w:w="2880" w:type="dxa"/>
+          </w:tcPr>
+          <w:p>
+            <w:pPr>
+              <w:spacing w:after="0" w:line="240" w:lineRule="auto"/>
+            </w:pPr>
+            <w:r>
+              <w:t>Double</w:t>
+            </w:r>
+          </w:p>
+        </w:tc>
+        <w:tc>
+          <w:tcPr>
+            <w:tcW w:w="2880" w:type="dxa"/>
+          </w:tcPr>
+          <w:p>
+            <w:pPr>
+              <w:spacing w:after="0" w:line="240" w:lineRule="auto"/>
+            </w:pPr>
+          </w:p>
+        </w:tc>
+      </w:tr>
+      <w:tr>
+        <w:tc>
+          <w:tcPr>
+            <w:tcW w:w="2880" w:type="dxa"/>
+          </w:tcPr>
+          <w:p>
+            <w:pPr>
+              <w:spacing w:after="0" w:line="240" w:lineRule="auto"/>
+            </w:pPr>
+            <w:r>
+              <w:t>Discount type</w:t>
+            </w:r>
+          </w:p>
+        </w:tc>
+        <w:tc>
+          <w:tcPr>
+            <w:tcW w:w="2880" w:type="dxa"/>
+          </w:tcPr>
+          <w:p>
+            <w:pPr>
+              <w:spacing w:after="0" w:line="240" w:lineRule="auto"/>
+            </w:pPr>
+            <w:r>
+              <w:t>Int</w:t>
+            </w:r>
+          </w:p>
+        </w:tc>
+        <w:tc>
+          <w:tcPr>
+            <w:tcW w:w="2880" w:type="dxa"/>
+          </w:tcPr>
+          <w:p>
+            <w:pPr>
+              <w:spacing w:after="0" w:line="240" w:lineRule="auto"/>
+            </w:pPr>
+            <w:r>
+              <w:t>Comment (1 fixed, 2 percentage)</w:t>
+            </w:r>
           </w:p>
         </w:tc>
       </w:tr>
@@ -2361,7 +2514,10 @@
             </w:pPr>
             <w:proofErr w:type="spellStart"/>
             <w:r>
-              <w:t>Session_id</w:t>
+              <w:t>batch</w:t>
+            </w:r>
+            <w:r>
+              <w:t>_id</w:t>
             </w:r>
             <w:proofErr w:type="spellEnd"/>
           </w:p>
@@ -2589,7 +2745,7 @@
             </w:pPr>
             <w:proofErr w:type="spellStart"/>
             <w:r>
-              <w:t>Session_id</w:t>
+              <w:t>Batch_id</w:t>
             </w:r>
             <w:proofErr w:type="spellEnd"/>
           </w:p>
@@ -2906,7 +3062,7 @@
             </w:pPr>
             <w:proofErr w:type="spellStart"/>
             <w:r>
-              <w:t>Session_id</w:t>
+              <w:t>Batch_id</w:t>
             </w:r>
             <w:proofErr w:type="spellEnd"/>
           </w:p>
@@ -3071,6 +3227,7 @@
             </w:pPr>
             <w:proofErr w:type="spellStart"/>
             <w:r>
+              <w:lastRenderedPageBreak/>
               <w:t>pass_marks</w:t>
             </w:r>
             <w:proofErr w:type="spellEnd"/>
@@ -3213,7 +3370,6 @@
             </w:pPr>
             <w:proofErr w:type="spellStart"/>
             <w:r>
-              <w:lastRenderedPageBreak/>
               <w:t>exam_id</w:t>
             </w:r>
             <w:proofErr w:type="spellEnd"/>
@@ -3616,7 +3772,7 @@
             </w:pPr>
             <w:proofErr w:type="spellStart"/>
             <w:r>
-              <w:t>Session_id</w:t>
+              <w:t>Batch_id</w:t>
             </w:r>
             <w:proofErr w:type="spellEnd"/>
           </w:p>
@@ -4427,7 +4583,7 @@
             </w:pPr>
             <w:proofErr w:type="spellStart"/>
             <w:r>
-              <w:t>Session_id</w:t>
+              <w:t>Batch_id</w:t>
             </w:r>
             <w:proofErr w:type="spellEnd"/>
           </w:p>
@@ -4692,6 +4848,7 @@
               <w:spacing w:after="0" w:line="240" w:lineRule="auto"/>
             </w:pPr>
             <w:r>
+              <w:lastRenderedPageBreak/>
               <w:t>status</w:t>
             </w:r>
           </w:p>
@@ -4767,7 +4924,6 @@
         <w:pStyle w:val="Heading2"/>
       </w:pPr>
       <w:r>
-        <w:lastRenderedPageBreak/>
         <w:br/>
       </w:r>
       <w:r>
@@ -5168,7 +5324,7 @@
 </file>
 
 <file path=word/endnotes.xml><?xml version="1.0" encoding="utf-8"?>
-<w:endnotes xmlns:wpc="http://schemas.microsoft.com/office/word/2010/wordprocessingCanvas" xmlns:cx="http://schemas.microsoft.com/office/drawing/2014/chartex" xmlns:cx1="http://schemas.microsoft.com/office/drawing/2015/9/8/chartex" xmlns:cx2="http://schemas.microsoft.com/office/drawing/2015/10/21/chartex" xmlns:cx3="http://schemas.microsoft.com/office/drawing/2016/5/9/chartex" xmlns:cx4="http://schemas.microsoft.com/office/drawing/2016/5/10/chartex" xmlns:cx5="http://schemas.microsoft.com/office/drawing/2016/5/11/chartex" xmlns:cx6="http://schemas.microsoft.com/office/drawing/2016/5/12/chartex" xmlns:cx7="http://schemas.microsoft.com/office/drawing/2016/5/13/chartex" xmlns:cx8="http://schemas.microsoft.com/office/drawing/2016/5/14/chartex" xmlns:mc="http://schemas.openxmlformats.org/markup-compatibility/2006" xmlns:aink="http://schemas.microsoft.com/office/drawing/2016/ink" xmlns:am3d="http://schemas.microsoft.com/office/drawing/2017/model3d" xmlns:o="urn:schemas-microsoft-com:office:office" xmlns:oel="http://schemas.microsoft.com/office/2019/extlst" xmlns:r="http://schemas.openxmlformats.org/officeDocument/2006/relationships" xmlns:m="http://schemas.openxmlformats.org/officeDocument/2006/math" xmlns:v="urn:schemas-microsoft-com:vml" xmlns:wp14="http://schemas.microsoft.com/office/word/2010/wordprocessingDrawing" xmlns:wp="http://schemas.openxmlformats.org/drawingml/2006/wordprocessingDrawing" xmlns:w10="urn:schemas-microsoft-com:office:word" xmlns:w="http://schemas.openxmlformats.org/wordprocessingml/2006/main" xmlns:w14="http://schemas.microsoft.com/office/word/2010/wordml" xmlns:w15="http://schemas.microsoft.com/office/word/2012/wordml" xmlns:w16cex="http://schemas.microsoft.com/office/word/2018/wordml/cex" xmlns:w16cid="http://schemas.microsoft.com/office/word/2016/wordml/cid" xmlns:w16="http://schemas.microsoft.com/office/word/2018/wordml" xmlns:w16du="http://schemas.microsoft.com/office/word/2023/wordml/word16du" xmlns:w16sdtdh="http://schemas.microsoft.com/office/word/2020/wordml/sdtdatahash" xmlns:w16sdtfl="http://schemas.microsoft.com/office/word/2024/wordml/sdtformatlock" xmlns:w16se="http://schemas.microsoft.com/office/word/2015/wordml/symex" xmlns:wpg="http://schemas.microsoft.com/office/word/2010/wordprocessingGroup" xmlns:wpi="http://schemas.microsoft.com/office/word/2010/wordprocessingInk" xmlns:wne="http://schemas.microsoft.com/office/word/2006/wordml" xmlns:wps="http://schemas.microsoft.com/office/word/2010/wordprocessingShape" mc:Ignorable="w14 w15 w16se w16cid w16 w16cex w16sdtdh w16sdtfl w16du wp14">
+<w:endnotes xmlns:wpc="http://schemas.microsoft.com/office/word/2010/wordprocessingCanvas" xmlns:cx="http://schemas.microsoft.com/office/drawing/2014/chartex" xmlns:cx1="http://schemas.microsoft.com/office/drawing/2015/9/8/chartex" xmlns:cx2="http://schemas.microsoft.com/office/drawing/2015/10/21/chartex" xmlns:cx3="http://schemas.microsoft.com/office/drawing/2016/5/9/chartex" xmlns:cx4="http://schemas.microsoft.com/office/drawing/2016/5/10/chartex" xmlns:cx5="http://schemas.microsoft.com/office/drawing/2016/5/11/chartex" xmlns:cx6="http://schemas.microsoft.com/office/drawing/2016/5/12/chartex" xmlns:cx7="http://schemas.microsoft.com/office/drawing/2016/5/13/chartex" xmlns:cx8="http://schemas.microsoft.com/office/drawing/2016/5/14/chartex" xmlns:mc="http://schemas.openxmlformats.org/markup-compatibility/2006" xmlns:aink="http://schemas.microsoft.com/office/drawing/2016/ink" xmlns:am3d="http://schemas.microsoft.com/office/drawing/2017/model3d" xmlns:o="urn:schemas-microsoft-com:office:office" xmlns:oel="http://schemas.microsoft.com/office/2019/extlst" xmlns:r="http://schemas.openxmlformats.org/officeDocument/2006/relationships" xmlns:m="http://schemas.openxmlformats.org/officeDocument/2006/math" xmlns:v="urn:schemas-microsoft-com:vml" xmlns:wp14="http://schemas.microsoft.com/office/word/2010/wordprocessingDrawing" xmlns:wp="http://schemas.openxmlformats.org/drawingml/2006/wordprocessingDrawing" xmlns:w10="urn:schemas-microsoft-com:office:word" xmlns:w="http://schemas.openxmlformats.org/wordprocessingml/2006/main" xmlns:w14="http://schemas.microsoft.com/office/word/2010/wordml" xmlns:w15="http://schemas.microsoft.com/office/word/2012/wordml" xmlns:w16cei="http://schemas.microsoft.com/office/word/2026/wordml/cei" xmlns:w16cex="http://schemas.microsoft.com/office/word/2018/wordml/cex" xmlns:w16cid="http://schemas.microsoft.com/office/word/2016/wordml/cid" xmlns:w16="http://schemas.microsoft.com/office/word/2018/wordml" xmlns:w16du="http://schemas.microsoft.com/office/word/2023/wordml/word16du" xmlns:w16sdtdh="http://schemas.microsoft.com/office/word/2020/wordml/sdtdatahash" xmlns:w16sdtfl="http://schemas.microsoft.com/office/word/2024/wordml/sdtformatlock" xmlns:w16se="http://schemas.microsoft.com/office/word/2015/wordml/symex" xmlns:wpg="http://schemas.microsoft.com/office/word/2010/wordprocessingGroup" xmlns:wpi="http://schemas.microsoft.com/office/word/2010/wordprocessingInk" xmlns:wne="http://schemas.microsoft.com/office/word/2006/wordml" xmlns:wps="http://schemas.microsoft.com/office/word/2010/wordprocessingShape" mc:Ignorable="w14 w15 w16se w16cid w16 w16cex w16sdtdh w16sdtfl w16du wp14">
   <w:endnote w:type="separator" w:id="-1">
     <w:p>
       <w:pPr>
@@ -5193,7 +5349,7 @@
 </file>
 
 <file path=word/footnotes.xml><?xml version="1.0" encoding="utf-8"?>
-<w:footnotes xmlns:wpc="http://schemas.microsoft.com/office/word/2010/wordprocessingCanvas" xmlns:cx="http://schemas.microsoft.com/office/drawing/2014/chartex" xmlns:cx1="http://schemas.microsoft.com/office/drawing/2015/9/8/chartex" xmlns:cx2="http://schemas.microsoft.com/office/drawing/2015/10/21/chartex" xmlns:cx3="http://schemas.microsoft.com/office/drawing/2016/5/9/chartex" xmlns:cx4="http://schemas.microsoft.com/office/drawing/2016/5/10/chartex" xmlns:cx5="http://schemas.microsoft.com/office/drawing/2016/5/11/chartex" xmlns:cx6="http://schemas.microsoft.com/office/drawing/2016/5/12/chartex" xmlns:cx7="http://schemas.microsoft.com/office/drawing/2016/5/13/chartex" xmlns:cx8="http://schemas.microsoft.com/office/drawing/2016/5/14/chartex" xmlns:mc="http://schemas.openxmlformats.org/markup-compatibility/2006" xmlns:aink="http://schemas.microsoft.com/office/drawing/2016/ink" xmlns:am3d="http://schemas.microsoft.com/office/drawing/2017/model3d" xmlns:o="urn:schemas-microsoft-com:office:office" xmlns:oel="http://schemas.microsoft.com/office/2019/extlst" xmlns:r="http://schemas.openxmlformats.org/officeDocument/2006/relationships" xmlns:m="http://schemas.openxmlformats.org/officeDocument/2006/math" xmlns:v="urn:schemas-microsoft-com:vml" xmlns:wp14="http://schemas.microsoft.com/office/word/2010/wordprocessingDrawing" xmlns:wp="http://schemas.openxmlformats.org/drawingml/2006/wordprocessingDrawing" xmlns:w10="urn:schemas-microsoft-com:office:word" xmlns:w="http://schemas.openxmlformats.org/wordprocessingml/2006/main" xmlns:w14="http://schemas.microsoft.com/office/word/2010/wordml" xmlns:w15="http://schemas.microsoft.com/office/word/2012/wordml" xmlns:w16cex="http://schemas.microsoft.com/office/word/2018/wordml/cex" xmlns:w16cid="http://schemas.microsoft.com/office/word/2016/wordml/cid" xmlns:w16="http://schemas.microsoft.com/office/word/2018/wordml" xmlns:w16du="http://schemas.microsoft.com/office/word/2023/wordml/word16du" xmlns:w16sdtdh="http://schemas.microsoft.com/office/word/2020/wordml/sdtdatahash" xmlns:w16sdtfl="http://schemas.microsoft.com/office/word/2024/wordml/sdtformatlock" xmlns:w16se="http://schemas.microsoft.com/office/word/2015/wordml/symex" xmlns:wpg="http://schemas.microsoft.com/office/word/2010/wordprocessingGroup" xmlns:wpi="http://schemas.microsoft.com/office/word/2010/wordprocessingInk" xmlns:wne="http://schemas.microsoft.com/office/word/2006/wordml" xmlns:wps="http://schemas.microsoft.com/office/word/2010/wordprocessingShape" mc:Ignorable="w14 w15 w16se w16cid w16 w16cex w16sdtdh w16sdtfl w16du wp14">
+<w:footnotes xmlns:wpc="http://schemas.microsoft.com/office/word/2010/wordprocessingCanvas" xmlns:cx="http://schemas.microsoft.com/office/drawing/2014/chartex" xmlns:cx1="http://schemas.microsoft.com/office/drawing/2015/9/8/chartex" xmlns:cx2="http://schemas.microsoft.com/office/drawing/2015/10/21/chartex" xmlns:cx3="http://schemas.microsoft.com/office/drawing/2016/5/9/chartex" xmlns:cx4="http://schemas.microsoft.com/office/drawing/2016/5/10/chartex" xmlns:cx5="http://schemas.microsoft.com/office/drawing/2016/5/11/chartex" xmlns:cx6="http://schemas.microsoft.com/office/drawing/2016/5/12/chartex" xmlns:cx7="http://schemas.microsoft.com/office/drawing/2016/5/13/chartex" xmlns:cx8="http://schemas.microsoft.com/office/drawing/2016/5/14/chartex" xmlns:mc="http://schemas.openxmlformats.org/markup-compatibility/2006" xmlns:aink="http://schemas.microsoft.com/office/drawing/2016/ink" xmlns:am3d="http://schemas.microsoft.com/office/drawing/2017/model3d" xmlns:o="urn:schemas-microsoft-com:office:office" xmlns:oel="http://schemas.microsoft.com/office/2019/extlst" xmlns:r="http://schemas.openxmlformats.org/officeDocument/2006/relationships" xmlns:m="http://schemas.openxmlformats.org/officeDocument/2006/math" xmlns:v="urn:schemas-microsoft-com:vml" xmlns:wp14="http://schemas.microsoft.com/office/word/2010/wordprocessingDrawing" xmlns:wp="http://schemas.openxmlformats.org/drawingml/2006/wordprocessingDrawing" xmlns:w10="urn:schemas-microsoft-com:office:word" xmlns:w="http://schemas.openxmlformats.org/wordprocessingml/2006/main" xmlns:w14="http://schemas.microsoft.com/office/word/2010/wordml" xmlns:w15="http://schemas.microsoft.com/office/word/2012/wordml" xmlns:w16cei="http://schemas.microsoft.com/office/word/2026/wordml/cei" xmlns:w16cex="http://schemas.microsoft.com/office/word/2018/wordml/cex" xmlns:w16cid="http://schemas.microsoft.com/office/word/2016/wordml/cid" xmlns:w16="http://schemas.microsoft.com/office/word/2018/wordml" xmlns:w16du="http://schemas.microsoft.com/office/word/2023/wordml/word16du" xmlns:w16sdtdh="http://schemas.microsoft.com/office/word/2020/wordml/sdtdatahash" xmlns:w16sdtfl="http://schemas.microsoft.com/office/word/2024/wordml/sdtformatlock" xmlns:w16se="http://schemas.microsoft.com/office/word/2015/wordml/symex" xmlns:wpg="http://schemas.microsoft.com/office/word/2010/wordprocessingGroup" xmlns:wpi="http://schemas.microsoft.com/office/word/2010/wordprocessingInk" xmlns:wne="http://schemas.microsoft.com/office/word/2006/wordml" xmlns:wps="http://schemas.microsoft.com/office/word/2010/wordprocessingShape" mc:Ignorable="w14 w15 w16se w16cid w16 w16cex w16sdtdh w16sdtfl w16du wp14">
   <w:footnote w:type="separator" w:id="-1">
     <w:p>
       <w:pPr>
@@ -5218,7 +5374,7 @@
 </file>
 
 <file path=word/numbering.xml><?xml version="1.0" encoding="utf-8"?>
-<w:numbering xmlns:wpc="http://schemas.microsoft.com/office/word/2010/wordprocessingCanvas" xmlns:cx="http://schemas.microsoft.com/office/drawing/2014/chartex" xmlns:cx1="http://schemas.microsoft.com/office/drawing/2015/9/8/chartex" xmlns:cx2="http://schemas.microsoft.com/office/drawing/2015/10/21/chartex" xmlns:cx3="http://schemas.microsoft.com/office/drawing/2016/5/9/chartex" xmlns:cx4="http://schemas.microsoft.com/office/drawing/2016/5/10/chartex" xmlns:cx5="http://schemas.microsoft.com/office/drawing/2016/5/11/chartex" xmlns:cx6="http://schemas.microsoft.com/office/drawing/2016/5/12/chartex" xmlns:cx7="http://schemas.microsoft.com/office/drawing/2016/5/13/chartex" xmlns:cx8="http://schemas.microsoft.com/office/drawing/2016/5/14/chartex" xmlns:mc="http://schemas.openxmlformats.org/markup-compatibility/2006" xmlns:aink="http://schemas.microsoft.com/office/drawing/2016/ink" xmlns:am3d="http://schemas.microsoft.com/office/drawing/2017/model3d" xmlns:o="urn:schemas-microsoft-com:office:office" xmlns:oel="http://schemas.microsoft.com/office/2019/extlst" xmlns:r="http://schemas.openxmlformats.org/officeDocument/2006/relationships" xmlns:m="http://schemas.openxmlformats.org/officeDocument/2006/math" xmlns:v="urn:schemas-microsoft-com:vml" xmlns:wp14="http://schemas.microsoft.com/office/word/2010/wordprocessingDrawing" xmlns:wp="http://schemas.openxmlformats.org/drawingml/2006/wordprocessingDrawing" xmlns:w10="urn:schemas-microsoft-com:office:word" xmlns:w="http://schemas.openxmlformats.org/wordprocessingml/2006/main" xmlns:w14="http://schemas.microsoft.com/office/word/2010/wordml" xmlns:w15="http://schemas.microsoft.com/office/word/2012/wordml" xmlns:w16cex="http://schemas.microsoft.com/office/word/2018/wordml/cex" xmlns:w16cid="http://schemas.microsoft.com/office/word/2016/wordml/cid" xmlns:w16="http://schemas.microsoft.com/office/word/2018/wordml" xmlns:w16du="http://schemas.microsoft.com/office/word/2023/wordml/word16du" xmlns:w16sdtdh="http://schemas.microsoft.com/office/word/2020/wordml/sdtdatahash" xmlns:w16sdtfl="http://schemas.microsoft.com/office/word/2024/wordml/sdtformatlock" xmlns:w16se="http://schemas.microsoft.com/office/word/2015/wordml/symex" xmlns:wpg="http://schemas.microsoft.com/office/word/2010/wordprocessingGroup" xmlns:wpi="http://schemas.microsoft.com/office/word/2010/wordprocessingInk" xmlns:wne="http://schemas.microsoft.com/office/word/2006/wordml" xmlns:wps="http://schemas.microsoft.com/office/word/2010/wordprocessingShape" mc:Ignorable="w14 w15 w16se w16cid w16 w16cex w16sdtdh w16sdtfl w16du wp14">
+<w:numbering xmlns:wpc="http://schemas.microsoft.com/office/word/2010/wordprocessingCanvas" xmlns:cx="http://schemas.microsoft.com/office/drawing/2014/chartex" xmlns:cx1="http://schemas.microsoft.com/office/drawing/2015/9/8/chartex" xmlns:cx2="http://schemas.microsoft.com/office/drawing/2015/10/21/chartex" xmlns:cx3="http://schemas.microsoft.com/office/drawing/2016/5/9/chartex" xmlns:cx4="http://schemas.microsoft.com/office/drawing/2016/5/10/chartex" xmlns:cx5="http://schemas.microsoft.com/office/drawing/2016/5/11/chartex" xmlns:cx6="http://schemas.microsoft.com/office/drawing/2016/5/12/chartex" xmlns:cx7="http://schemas.microsoft.com/office/drawing/2016/5/13/chartex" xmlns:cx8="http://schemas.microsoft.com/office/drawing/2016/5/14/chartex" xmlns:mc="http://schemas.openxmlformats.org/markup-compatibility/2006" xmlns:aink="http://schemas.microsoft.com/office/drawing/2016/ink" xmlns:am3d="http://schemas.microsoft.com/office/drawing/2017/model3d" xmlns:o="urn:schemas-microsoft-com:office:office" xmlns:oel="http://schemas.microsoft.com/office/2019/extlst" xmlns:r="http://schemas.openxmlformats.org/officeDocument/2006/relationships" xmlns:m="http://schemas.openxmlformats.org/officeDocument/2006/math" xmlns:v="urn:schemas-microsoft-com:vml" xmlns:wp14="http://schemas.microsoft.com/office/word/2010/wordprocessingDrawing" xmlns:wp="http://schemas.openxmlformats.org/drawingml/2006/wordprocessingDrawing" xmlns:w10="urn:schemas-microsoft-com:office:word" xmlns:w="http://schemas.openxmlformats.org/wordprocessingml/2006/main" xmlns:w14="http://schemas.microsoft.com/office/word/2010/wordml" xmlns:w15="http://schemas.microsoft.com/office/word/2012/wordml" xmlns:w16cei="http://schemas.microsoft.com/office/word/2026/wordml/cei" xmlns:w16cex="http://schemas.microsoft.com/office/word/2018/wordml/cex" xmlns:w16cid="http://schemas.microsoft.com/office/word/2016/wordml/cid" xmlns:w16="http://schemas.microsoft.com/office/word/2018/wordml" xmlns:w16du="http://schemas.microsoft.com/office/word/2023/wordml/word16du" xmlns:w16sdtdh="http://schemas.microsoft.com/office/word/2020/wordml/sdtdatahash" xmlns:w16sdtfl="http://schemas.microsoft.com/office/word/2024/wordml/sdtformatlock" xmlns:w16se="http://schemas.microsoft.com/office/word/2015/wordml/symex" xmlns:wpg="http://schemas.microsoft.com/office/word/2010/wordprocessingGroup" xmlns:wpi="http://schemas.microsoft.com/office/word/2010/wordprocessingInk" xmlns:wne="http://schemas.microsoft.com/office/word/2006/wordml" xmlns:wps="http://schemas.microsoft.com/office/word/2010/wordprocessingShape" mc:Ignorable="w14 w15 w16se w16cid w16 w16cex w16sdtdh w16sdtfl w16du wp14">
   <w:abstractNum w:abstractNumId="0" w15:restartNumberingAfterBreak="0">
     <w:nsid w:val="FFFFFF7E"/>
     <w:multiLevelType w:val="singleLevel"/>
@@ -5960,6 +6116,7 @@
   <w:style w:type="character" w:default="1" w:styleId="DefaultParagraphFont">
     <w:name w:val="Default Paragraph Font"/>
     <w:uiPriority w:val="1"/>
+    <w:semiHidden/>
     <w:unhideWhenUsed/>
   </w:style>
   <w:style w:type="table" w:default="1" w:styleId="TableNormal">

</xml_diff>